<commit_message>
Fix advisory header boxes: exact logo navy border, aligned to logo edges
The header outline in every advisory was Word's standard dark blue
(#002060) instead of the logo's navy (#002641), and the logo overflowed
above the box because of cell padding and fixed row heights. All 14
Word sources updated (border color matched to the logo, logo cell
padding zeroed, row height set to hug the logo) and PDFs regenerated.

Co-Authored-By: Claude Fable 5 <noreply@anthropic.com>
</commit_message>
<xml_diff>
--- a/advisories/source/info-for-attorneys-and-clients-regarding-acds.docx
+++ b/advisories/source/info-for-attorneys-and-clients-regarding-acds.docx
@@ -1,6 +1,6 @@
 
 <file path=word/document.xml><?xml version="1.0" encoding="utf-8"?>
-<w:document xmlns:wpc="http://schemas.microsoft.com/office/word/2010/wordprocessingCanvas" xmlns:cx="http://schemas.microsoft.com/office/drawing/2014/chartex" xmlns:cx1="http://schemas.microsoft.com/office/drawing/2015/9/8/chartex" xmlns:cx2="http://schemas.microsoft.com/office/drawing/2015/10/21/chartex" xmlns:cx3="http://schemas.microsoft.com/office/drawing/2016/5/9/chartex" xmlns:cx4="http://schemas.microsoft.com/office/drawing/2016/5/10/chartex" xmlns:cx5="http://schemas.microsoft.com/office/drawing/2016/5/11/chartex" xmlns:cx6="http://schemas.microsoft.com/office/drawing/2016/5/12/chartex" xmlns:cx7="http://schemas.microsoft.com/office/drawing/2016/5/13/chartex" xmlns:cx8="http://schemas.microsoft.com/office/drawing/2016/5/14/chartex" xmlns:mc="http://schemas.openxmlformats.org/markup-compatibility/2006" xmlns:aink="http://schemas.microsoft.com/office/drawing/2016/ink" xmlns:am3d="http://schemas.microsoft.com/office/drawing/2017/model3d" xmlns:o="urn:schemas-microsoft-com:office:office" xmlns:oel="http://schemas.microsoft.com/office/2019/extlst" xmlns:r="http://schemas.openxmlformats.org/officeDocument/2006/relationships" xmlns:m="http://schemas.openxmlformats.org/officeDocument/2006/math" xmlns:v="urn:schemas-microsoft-com:vml" xmlns:wp14="http://schemas.microsoft.com/office/word/2010/wordprocessingDrawing" xmlns:wp="http://schemas.openxmlformats.org/drawingml/2006/wordprocessingDrawing" xmlns:w10="urn:schemas-microsoft-com:office:word" xmlns:w="http://schemas.openxmlformats.org/wordprocessingml/2006/main" xmlns:w14="http://schemas.microsoft.com/office/word/2010/wordml" xmlns:w15="http://schemas.microsoft.com/office/word/2012/wordml" xmlns:w16cex="http://schemas.microsoft.com/office/word/2018/wordml/cex" xmlns:w16cid="http://schemas.microsoft.com/office/word/2016/wordml/cid" xmlns:w16="http://schemas.microsoft.com/office/word/2018/wordml" xmlns:w16du="http://schemas.microsoft.com/office/word/2023/wordml/word16du" xmlns:w16sdtdh="http://schemas.microsoft.com/office/word/2020/wordml/sdtdatahash" xmlns:w16sdtfl="http://schemas.microsoft.com/office/word/2024/wordml/sdtformatlock" xmlns:w16se="http://schemas.microsoft.com/office/word/2015/wordml/symex" xmlns:wpg="http://schemas.microsoft.com/office/word/2010/wordprocessingGroup" xmlns:wpi="http://schemas.microsoft.com/office/word/2010/wordprocessingInk" xmlns:wne="http://schemas.microsoft.com/office/word/2006/wordml" xmlns:wps="http://schemas.microsoft.com/office/word/2010/wordprocessingShape" mc:Ignorable="w14 w15 w16se w16cid w16 w16cex w16sdtdh w16sdtfl w16du wp14">
+<w:document xmlns:wpc="http://schemas.microsoft.com/office/word/2010/wordprocessingCanvas" xmlns:cx="http://schemas.microsoft.com/office/drawing/2014/chartex" xmlns:cx1="http://schemas.microsoft.com/office/drawing/2015/9/8/chartex" xmlns:cx2="http://schemas.microsoft.com/office/drawing/2015/10/21/chartex" xmlns:cx3="http://schemas.microsoft.com/office/drawing/2016/5/9/chartex" xmlns:cx4="http://schemas.microsoft.com/office/drawing/2016/5/10/chartex" xmlns:cx5="http://schemas.microsoft.com/office/drawing/2016/5/11/chartex" xmlns:cx6="http://schemas.microsoft.com/office/drawing/2016/5/12/chartex" xmlns:cx7="http://schemas.microsoft.com/office/drawing/2016/5/13/chartex" xmlns:cx8="http://schemas.microsoft.com/office/drawing/2016/5/14/chartex" xmlns:mc="http://schemas.openxmlformats.org/markup-compatibility/2006" xmlns:aink="http://schemas.microsoft.com/office/drawing/2016/ink" xmlns:am3d="http://schemas.microsoft.com/office/drawing/2017/model3d" xmlns:o="urn:schemas-microsoft-com:office:office" xmlns:oel="http://schemas.microsoft.com/office/2019/extlst" xmlns:r="http://schemas.openxmlformats.org/officeDocument/2006/relationships" xmlns:m="http://schemas.openxmlformats.org/officeDocument/2006/math" xmlns:v="urn:schemas-microsoft-com:vml" xmlns:wp14="http://schemas.microsoft.com/office/word/2010/wordprocessingDrawing" xmlns:wp="http://schemas.openxmlformats.org/drawingml/2006/wordprocessingDrawing" xmlns:w10="urn:schemas-microsoft-com:office:word" xmlns:w="http://schemas.openxmlformats.org/wordprocessingml/2006/main" xmlns:w14="http://schemas.microsoft.com/office/word/2010/wordml" xmlns:w15="http://schemas.microsoft.com/office/word/2012/wordml" xmlns:w16cei="http://schemas.microsoft.com/office/word/2026/wordml/cei" xmlns:w16cex="http://schemas.microsoft.com/office/word/2018/wordml/cex" xmlns:w16cid="http://schemas.microsoft.com/office/word/2016/wordml/cid" xmlns:w16="http://schemas.microsoft.com/office/word/2018/wordml" xmlns:w16du="http://schemas.microsoft.com/office/word/2023/wordml/word16du" xmlns:w16sdtdh="http://schemas.microsoft.com/office/word/2020/wordml/sdtdatahash" xmlns:w16sdtfl="http://schemas.microsoft.com/office/word/2024/wordml/sdtformatlock" xmlns:w16se="http://schemas.microsoft.com/office/word/2015/wordml/symex" xmlns:wpg="http://schemas.microsoft.com/office/word/2010/wordprocessingGroup" xmlns:wpi="http://schemas.microsoft.com/office/word/2010/wordprocessingInk" xmlns:wne="http://schemas.microsoft.com/office/word/2006/wordml" xmlns:wps="http://schemas.microsoft.com/office/word/2010/wordprocessingShape" mc:Ignorable="w14 w15 w16se w16cid w16 w16cex w16sdtdh w16sdtfl w16du wp14">
   <w:body>
     <w:p>
       <w:pPr>
@@ -175,35 +175,7 @@
         <w:rPr>
           <w:sz w:val="24"/>
         </w:rPr>
-        <w:t xml:space="preserve">immigration </w:t>
-      </w:r>
-      <w:proofErr w:type="gramStart"/>
-      <w:r>
-        <w:rPr>
-          <w:sz w:val="24"/>
-        </w:rPr>
-        <w:t>consequences</w:t>
-      </w:r>
-      <w:proofErr w:type="gramEnd"/>
-      <w:r>
-        <w:rPr>
-          <w:sz w:val="24"/>
-        </w:rPr>
-        <w:t xml:space="preserve"> and you must therefore (1) screen your client for certain situations, and (2) provide </w:t>
-      </w:r>
-      <w:proofErr w:type="gramStart"/>
-      <w:r>
-        <w:rPr>
-          <w:sz w:val="24"/>
-        </w:rPr>
-        <w:t>them</w:t>
-      </w:r>
-      <w:proofErr w:type="gramEnd"/>
-      <w:r>
-        <w:rPr>
-          <w:sz w:val="24"/>
-        </w:rPr>
-        <w:t xml:space="preserve"> advice on immigration consequences as follows:</w:t>
+        <w:t>immigration consequences and you must therefore (1) screen your client for certain situations, and (2) provide them advice on immigration consequences as follows:</w:t>
       </w:r>
     </w:p>
     <w:p>
@@ -840,14 +812,12 @@
         </w:rPr>
         <w:t xml:space="preserve">contact </w:t>
       </w:r>
-      <w:proofErr w:type="gramStart"/>
       <w:r>
         <w:rPr>
           <w:sz w:val="24"/>
         </w:rPr>
         <w:t>the RIAC</w:t>
       </w:r>
-      <w:proofErr w:type="gramEnd"/>
       <w:r>
         <w:rPr>
           <w:sz w:val="24"/>
@@ -1522,27 +1492,7 @@
           <w:sz w:val="24"/>
           <w:szCs w:val="28"/>
         </w:rPr>
-        <w:t xml:space="preserve">he RIAC can provide your </w:t>
-      </w:r>
-      <w:proofErr w:type="gramStart"/>
-      <w:r>
-        <w:rPr>
-          <w:b/>
-          <w:bCs/>
-          <w:sz w:val="24"/>
-          <w:szCs w:val="28"/>
-        </w:rPr>
-        <w:t>attorney</w:t>
-      </w:r>
-      <w:proofErr w:type="gramEnd"/>
-      <w:r>
-        <w:rPr>
-          <w:b/>
-          <w:bCs/>
-          <w:sz w:val="24"/>
-          <w:szCs w:val="28"/>
-        </w:rPr>
-        <w:t xml:space="preserve"> more detailed advice on these topics</w:t>
+        <w:t>he RIAC can provide your attorney more detailed advice on these topics</w:t>
       </w:r>
       <w:r>
         <w:rPr>
@@ -1836,15 +1786,7 @@
               <w:spacing w:after="0" w:line="240" w:lineRule="auto"/>
             </w:pPr>
             <w:r>
-              <w:t xml:space="preserve">Immigration Consequences Of </w:t>
-            </w:r>
-            <w:proofErr w:type="gramStart"/>
-            <w:r>
-              <w:t>A New</w:t>
-            </w:r>
-            <w:proofErr w:type="gramEnd"/>
-            <w:r>
-              <w:t xml:space="preserve"> York ACD</w:t>
+              <w:t>Immigration Consequences Of A New York ACD</w:t>
             </w:r>
           </w:p>
         </w:tc>
@@ -2182,18 +2124,10 @@
         <w:t xml:space="preserve"> </w:t>
       </w:r>
       <w:r>
-        <w:t xml:space="preserve">with any controlled substance </w:t>
-      </w:r>
-      <w:proofErr w:type="gramStart"/>
-      <w:r>
-        <w:t xml:space="preserve">offense, </w:t>
-      </w:r>
-      <w:r>
-        <w:t>or</w:t>
-      </w:r>
-      <w:proofErr w:type="gramEnd"/>
-      <w:r>
-        <w:t xml:space="preserve"> </w:t>
+        <w:t xml:space="preserve">with any controlled substance offense, </w:t>
+      </w:r>
+      <w:r>
+        <w:t xml:space="preserve">or </w:t>
       </w:r>
       <w:r>
         <w:rPr>
@@ -2267,62 +2201,21 @@
           <w:b/>
           <w:bCs/>
         </w:rPr>
-        <w:t xml:space="preserve">ACD’s – And </w:t>
-      </w:r>
-      <w:proofErr w:type="gramStart"/>
+        <w:t xml:space="preserve">ACD’s – And The Underlying Arrest Report - Must Still Be Disclosed </w:t>
+      </w:r>
       <w:r>
         <w:rPr>
           <w:b/>
           <w:bCs/>
         </w:rPr>
-        <w:t>The</w:t>
-      </w:r>
-      <w:proofErr w:type="gramEnd"/>
+        <w:t xml:space="preserve">With Many Immigration Applications </w:t>
+      </w:r>
       <w:r>
         <w:rPr>
           <w:b/>
           <w:bCs/>
         </w:rPr>
-        <w:t xml:space="preserve"> Underlying Arrest Report - Must Still Be Disclosed </w:t>
-      </w:r>
-      <w:proofErr w:type="gramStart"/>
-      <w:r>
-        <w:rPr>
-          <w:b/>
-          <w:bCs/>
-        </w:rPr>
-        <w:t>With</w:t>
-      </w:r>
-      <w:proofErr w:type="gramEnd"/>
-      <w:r>
-        <w:rPr>
-          <w:b/>
-          <w:bCs/>
-        </w:rPr>
-        <w:t xml:space="preserve"> Many Immigration Applications </w:t>
-      </w:r>
-      <w:r>
-        <w:rPr>
-          <w:b/>
-          <w:bCs/>
-        </w:rPr>
-        <w:t xml:space="preserve">(Even If </w:t>
-      </w:r>
-      <w:proofErr w:type="gramStart"/>
-      <w:r>
-        <w:rPr>
-          <w:b/>
-          <w:bCs/>
-        </w:rPr>
-        <w:t>The</w:t>
-      </w:r>
-      <w:proofErr w:type="gramEnd"/>
-      <w:r>
-        <w:rPr>
-          <w:b/>
-          <w:bCs/>
-        </w:rPr>
-        <w:t xml:space="preserve"> Criminal Case </w:t>
+        <w:t xml:space="preserve">(Even If The Criminal Case </w:t>
       </w:r>
       <w:r>
         <w:rPr>
@@ -2417,48 +2310,24 @@
           <w:b/>
           <w:bCs/>
         </w:rPr>
-        <w:t xml:space="preserve">ACD’s can be </w:t>
-      </w:r>
-      <w:proofErr w:type="gramStart"/>
+        <w:t>ACD’s can be restored, and can result in a conviction if the case is not dismissed</w:t>
+      </w:r>
       <w:r>
         <w:rPr>
           <w:b/>
           <w:bCs/>
         </w:rPr>
-        <w:t>restored, and</w:t>
-      </w:r>
-      <w:proofErr w:type="gramEnd"/>
+        <w:t>.</w:t>
+      </w:r>
       <w:r>
         <w:rPr>
           <w:b/>
           <w:bCs/>
         </w:rPr>
-        <w:t xml:space="preserve"> can result in a conviction if the case is not dismissed</w:t>
-      </w:r>
-      <w:r>
-        <w:rPr>
-          <w:b/>
-          <w:bCs/>
-        </w:rPr>
-        <w:t>.</w:t>
-      </w:r>
-      <w:r>
-        <w:rPr>
-          <w:b/>
-          <w:bCs/>
-        </w:rPr>
         <w:t xml:space="preserve"> </w:t>
       </w:r>
       <w:r>
-        <w:t>If you violate any of the terms of the ACD, your criminal case can be restored (reopened</w:t>
-      </w:r>
-      <w:proofErr w:type="gramStart"/>
-      <w:r>
-        <w:t>)</w:t>
-      </w:r>
-      <w:proofErr w:type="gramEnd"/>
-      <w:r>
-        <w:t xml:space="preserve"> and you could face immigration consequences based on the original charges.</w:t>
+        <w:t>If you violate any of the terms of the ACD, your criminal case can be restored (reopened) and you could face immigration consequences based on the original charges.</w:t>
       </w:r>
     </w:p>
     <w:p>
@@ -3221,7 +3090,7 @@
 </file>
 
 <file path=word/endnotes.xml><?xml version="1.0" encoding="utf-8"?>
-<w:endnotes xmlns:wpc="http://schemas.microsoft.com/office/word/2010/wordprocessingCanvas" xmlns:cx="http://schemas.microsoft.com/office/drawing/2014/chartex" xmlns:cx1="http://schemas.microsoft.com/office/drawing/2015/9/8/chartex" xmlns:cx2="http://schemas.microsoft.com/office/drawing/2015/10/21/chartex" xmlns:cx3="http://schemas.microsoft.com/office/drawing/2016/5/9/chartex" xmlns:cx4="http://schemas.microsoft.com/office/drawing/2016/5/10/chartex" xmlns:cx5="http://schemas.microsoft.com/office/drawing/2016/5/11/chartex" xmlns:cx6="http://schemas.microsoft.com/office/drawing/2016/5/12/chartex" xmlns:cx7="http://schemas.microsoft.com/office/drawing/2016/5/13/chartex" xmlns:cx8="http://schemas.microsoft.com/office/drawing/2016/5/14/chartex" xmlns:mc="http://schemas.openxmlformats.org/markup-compatibility/2006" xmlns:aink="http://schemas.microsoft.com/office/drawing/2016/ink" xmlns:am3d="http://schemas.microsoft.com/office/drawing/2017/model3d" xmlns:o="urn:schemas-microsoft-com:office:office" xmlns:oel="http://schemas.microsoft.com/office/2019/extlst" xmlns:r="http://schemas.openxmlformats.org/officeDocument/2006/relationships" xmlns:m="http://schemas.openxmlformats.org/officeDocument/2006/math" xmlns:v="urn:schemas-microsoft-com:vml" xmlns:wp14="http://schemas.microsoft.com/office/word/2010/wordprocessingDrawing" xmlns:wp="http://schemas.openxmlformats.org/drawingml/2006/wordprocessingDrawing" xmlns:w10="urn:schemas-microsoft-com:office:word" xmlns:w="http://schemas.openxmlformats.org/wordprocessingml/2006/main" xmlns:w14="http://schemas.microsoft.com/office/word/2010/wordml" xmlns:w15="http://schemas.microsoft.com/office/word/2012/wordml" xmlns:w16cex="http://schemas.microsoft.com/office/word/2018/wordml/cex" xmlns:w16cid="http://schemas.microsoft.com/office/word/2016/wordml/cid" xmlns:w16="http://schemas.microsoft.com/office/word/2018/wordml" xmlns:w16du="http://schemas.microsoft.com/office/word/2023/wordml/word16du" xmlns:w16sdtdh="http://schemas.microsoft.com/office/word/2020/wordml/sdtdatahash" xmlns:w16sdtfl="http://schemas.microsoft.com/office/word/2024/wordml/sdtformatlock" xmlns:w16se="http://schemas.microsoft.com/office/word/2015/wordml/symex" xmlns:wpg="http://schemas.microsoft.com/office/word/2010/wordprocessingGroup" xmlns:wpi="http://schemas.microsoft.com/office/word/2010/wordprocessingInk" xmlns:wne="http://schemas.microsoft.com/office/word/2006/wordml" xmlns:wps="http://schemas.microsoft.com/office/word/2010/wordprocessingShape" mc:Ignorable="w14 w15 w16se w16cid w16 w16cex w16sdtdh w16sdtfl w16du wp14">
+<w:endnotes xmlns:wpc="http://schemas.microsoft.com/office/word/2010/wordprocessingCanvas" xmlns:cx="http://schemas.microsoft.com/office/drawing/2014/chartex" xmlns:cx1="http://schemas.microsoft.com/office/drawing/2015/9/8/chartex" xmlns:cx2="http://schemas.microsoft.com/office/drawing/2015/10/21/chartex" xmlns:cx3="http://schemas.microsoft.com/office/drawing/2016/5/9/chartex" xmlns:cx4="http://schemas.microsoft.com/office/drawing/2016/5/10/chartex" xmlns:cx5="http://schemas.microsoft.com/office/drawing/2016/5/11/chartex" xmlns:cx6="http://schemas.microsoft.com/office/drawing/2016/5/12/chartex" xmlns:cx7="http://schemas.microsoft.com/office/drawing/2016/5/13/chartex" xmlns:cx8="http://schemas.microsoft.com/office/drawing/2016/5/14/chartex" xmlns:mc="http://schemas.openxmlformats.org/markup-compatibility/2006" xmlns:aink="http://schemas.microsoft.com/office/drawing/2016/ink" xmlns:am3d="http://schemas.microsoft.com/office/drawing/2017/model3d" xmlns:o="urn:schemas-microsoft-com:office:office" xmlns:oel="http://schemas.microsoft.com/office/2019/extlst" xmlns:r="http://schemas.openxmlformats.org/officeDocument/2006/relationships" xmlns:m="http://schemas.openxmlformats.org/officeDocument/2006/math" xmlns:v="urn:schemas-microsoft-com:vml" xmlns:wp14="http://schemas.microsoft.com/office/word/2010/wordprocessingDrawing" xmlns:wp="http://schemas.openxmlformats.org/drawingml/2006/wordprocessingDrawing" xmlns:w10="urn:schemas-microsoft-com:office:word" xmlns:w="http://schemas.openxmlformats.org/wordprocessingml/2006/main" xmlns:w14="http://schemas.microsoft.com/office/word/2010/wordml" xmlns:w15="http://schemas.microsoft.com/office/word/2012/wordml" xmlns:w16cei="http://schemas.microsoft.com/office/word/2026/wordml/cei" xmlns:w16cex="http://schemas.microsoft.com/office/word/2018/wordml/cex" xmlns:w16cid="http://schemas.microsoft.com/office/word/2016/wordml/cid" xmlns:w16="http://schemas.microsoft.com/office/word/2018/wordml" xmlns:w16du="http://schemas.microsoft.com/office/word/2023/wordml/word16du" xmlns:w16sdtdh="http://schemas.microsoft.com/office/word/2020/wordml/sdtdatahash" xmlns:w16sdtfl="http://schemas.microsoft.com/office/word/2024/wordml/sdtformatlock" xmlns:w16se="http://schemas.microsoft.com/office/word/2015/wordml/symex" xmlns:wpg="http://schemas.microsoft.com/office/word/2010/wordprocessingGroup" xmlns:wpi="http://schemas.microsoft.com/office/word/2010/wordprocessingInk" xmlns:wne="http://schemas.microsoft.com/office/word/2006/wordml" xmlns:wps="http://schemas.microsoft.com/office/word/2010/wordprocessingShape" mc:Ignorable="w14 w15 w16se w16cid w16 w16cex w16sdtdh w16sdtfl w16du wp14">
   <w:endnote w:type="separator" w:id="-1">
     <w:p>
       <w:pPr>
@@ -3246,7 +3115,7 @@
 </file>
 
 <file path=word/footer1.xml><?xml version="1.0" encoding="utf-8"?>
-<w:ftr xmlns:wpc="http://schemas.microsoft.com/office/word/2010/wordprocessingCanvas" xmlns:cx="http://schemas.microsoft.com/office/drawing/2014/chartex" xmlns:cx1="http://schemas.microsoft.com/office/drawing/2015/9/8/chartex" xmlns:cx2="http://schemas.microsoft.com/office/drawing/2015/10/21/chartex" xmlns:cx3="http://schemas.microsoft.com/office/drawing/2016/5/9/chartex" xmlns:cx4="http://schemas.microsoft.com/office/drawing/2016/5/10/chartex" xmlns:cx5="http://schemas.microsoft.com/office/drawing/2016/5/11/chartex" xmlns:cx6="http://schemas.microsoft.com/office/drawing/2016/5/12/chartex" xmlns:cx7="http://schemas.microsoft.com/office/drawing/2016/5/13/chartex" xmlns:cx8="http://schemas.microsoft.com/office/drawing/2016/5/14/chartex" xmlns:mc="http://schemas.openxmlformats.org/markup-compatibility/2006" xmlns:aink="http://schemas.microsoft.com/office/drawing/2016/ink" xmlns:am3d="http://schemas.microsoft.com/office/drawing/2017/model3d" xmlns:o="urn:schemas-microsoft-com:office:office" xmlns:oel="http://schemas.microsoft.com/office/2019/extlst" xmlns:r="http://schemas.openxmlformats.org/officeDocument/2006/relationships" xmlns:m="http://schemas.openxmlformats.org/officeDocument/2006/math" xmlns:v="urn:schemas-microsoft-com:vml" xmlns:wp14="http://schemas.microsoft.com/office/word/2010/wordprocessingDrawing" xmlns:wp="http://schemas.openxmlformats.org/drawingml/2006/wordprocessingDrawing" xmlns:w10="urn:schemas-microsoft-com:office:word" xmlns:w="http://schemas.openxmlformats.org/wordprocessingml/2006/main" xmlns:w14="http://schemas.microsoft.com/office/word/2010/wordml" xmlns:w15="http://schemas.microsoft.com/office/word/2012/wordml" xmlns:w16cex="http://schemas.microsoft.com/office/word/2018/wordml/cex" xmlns:w16cid="http://schemas.microsoft.com/office/word/2016/wordml/cid" xmlns:w16="http://schemas.microsoft.com/office/word/2018/wordml" xmlns:w16du="http://schemas.microsoft.com/office/word/2023/wordml/word16du" xmlns:w16sdtdh="http://schemas.microsoft.com/office/word/2020/wordml/sdtdatahash" xmlns:w16sdtfl="http://schemas.microsoft.com/office/word/2024/wordml/sdtformatlock" xmlns:w16se="http://schemas.microsoft.com/office/word/2015/wordml/symex" xmlns:wpg="http://schemas.microsoft.com/office/word/2010/wordprocessingGroup" xmlns:wpi="http://schemas.microsoft.com/office/word/2010/wordprocessingInk" xmlns:wne="http://schemas.microsoft.com/office/word/2006/wordml" xmlns:wps="http://schemas.microsoft.com/office/word/2010/wordprocessingShape" mc:Ignorable="w14 w15 w16se w16cid w16 w16cex w16sdtdh w16sdtfl w16du wp14">
+<w:ftr xmlns:wpc="http://schemas.microsoft.com/office/word/2010/wordprocessingCanvas" xmlns:cx="http://schemas.microsoft.com/office/drawing/2014/chartex" xmlns:cx1="http://schemas.microsoft.com/office/drawing/2015/9/8/chartex" xmlns:cx2="http://schemas.microsoft.com/office/drawing/2015/10/21/chartex" xmlns:cx3="http://schemas.microsoft.com/office/drawing/2016/5/9/chartex" xmlns:cx4="http://schemas.microsoft.com/office/drawing/2016/5/10/chartex" xmlns:cx5="http://schemas.microsoft.com/office/drawing/2016/5/11/chartex" xmlns:cx6="http://schemas.microsoft.com/office/drawing/2016/5/12/chartex" xmlns:cx7="http://schemas.microsoft.com/office/drawing/2016/5/13/chartex" xmlns:cx8="http://schemas.microsoft.com/office/drawing/2016/5/14/chartex" xmlns:mc="http://schemas.openxmlformats.org/markup-compatibility/2006" xmlns:aink="http://schemas.microsoft.com/office/drawing/2016/ink" xmlns:am3d="http://schemas.microsoft.com/office/drawing/2017/model3d" xmlns:o="urn:schemas-microsoft-com:office:office" xmlns:oel="http://schemas.microsoft.com/office/2019/extlst" xmlns:r="http://schemas.openxmlformats.org/officeDocument/2006/relationships" xmlns:m="http://schemas.openxmlformats.org/officeDocument/2006/math" xmlns:v="urn:schemas-microsoft-com:vml" xmlns:wp14="http://schemas.microsoft.com/office/word/2010/wordprocessingDrawing" xmlns:wp="http://schemas.openxmlformats.org/drawingml/2006/wordprocessingDrawing" xmlns:w10="urn:schemas-microsoft-com:office:word" xmlns:w="http://schemas.openxmlformats.org/wordprocessingml/2006/main" xmlns:w14="http://schemas.microsoft.com/office/word/2010/wordml" xmlns:w15="http://schemas.microsoft.com/office/word/2012/wordml" xmlns:w16cei="http://schemas.microsoft.com/office/word/2026/wordml/cei" xmlns:w16cex="http://schemas.microsoft.com/office/word/2018/wordml/cex" xmlns:w16cid="http://schemas.microsoft.com/office/word/2016/wordml/cid" xmlns:w16="http://schemas.microsoft.com/office/word/2018/wordml" xmlns:w16du="http://schemas.microsoft.com/office/word/2023/wordml/word16du" xmlns:w16sdtdh="http://schemas.microsoft.com/office/word/2020/wordml/sdtdatahash" xmlns:w16sdtfl="http://schemas.microsoft.com/office/word/2024/wordml/sdtformatlock" xmlns:w16se="http://schemas.microsoft.com/office/word/2015/wordml/symex" xmlns:wpg="http://schemas.microsoft.com/office/word/2010/wordprocessingGroup" xmlns:wpi="http://schemas.microsoft.com/office/word/2010/wordprocessingInk" xmlns:wne="http://schemas.microsoft.com/office/word/2006/wordml" xmlns:wps="http://schemas.microsoft.com/office/word/2010/wordprocessingShape" mc:Ignorable="w14 w15 w16se w16cid w16 w16cex w16sdtdh w16sdtfl w16du wp14">
   <w:p>
     <w:pPr>
       <w:pStyle w:val="Footer"/>
@@ -3256,7 +3125,7 @@
 </file>
 
 <file path=word/footer2.xml><?xml version="1.0" encoding="utf-8"?>
-<w:ftr xmlns:wpc="http://schemas.microsoft.com/office/word/2010/wordprocessingCanvas" xmlns:cx="http://schemas.microsoft.com/office/drawing/2014/chartex" xmlns:cx1="http://schemas.microsoft.com/office/drawing/2015/9/8/chartex" xmlns:cx2="http://schemas.microsoft.com/office/drawing/2015/10/21/chartex" xmlns:cx3="http://schemas.microsoft.com/office/drawing/2016/5/9/chartex" xmlns:cx4="http://schemas.microsoft.com/office/drawing/2016/5/10/chartex" xmlns:cx5="http://schemas.microsoft.com/office/drawing/2016/5/11/chartex" xmlns:cx6="http://schemas.microsoft.com/office/drawing/2016/5/12/chartex" xmlns:cx7="http://schemas.microsoft.com/office/drawing/2016/5/13/chartex" xmlns:cx8="http://schemas.microsoft.com/office/drawing/2016/5/14/chartex" xmlns:mc="http://schemas.openxmlformats.org/markup-compatibility/2006" xmlns:aink="http://schemas.microsoft.com/office/drawing/2016/ink" xmlns:am3d="http://schemas.microsoft.com/office/drawing/2017/model3d" xmlns:o="urn:schemas-microsoft-com:office:office" xmlns:oel="http://schemas.microsoft.com/office/2019/extlst" xmlns:r="http://schemas.openxmlformats.org/officeDocument/2006/relationships" xmlns:m="http://schemas.openxmlformats.org/officeDocument/2006/math" xmlns:v="urn:schemas-microsoft-com:vml" xmlns:wp14="http://schemas.microsoft.com/office/word/2010/wordprocessingDrawing" xmlns:wp="http://schemas.openxmlformats.org/drawingml/2006/wordprocessingDrawing" xmlns:w10="urn:schemas-microsoft-com:office:word" xmlns:w="http://schemas.openxmlformats.org/wordprocessingml/2006/main" xmlns:w14="http://schemas.microsoft.com/office/word/2010/wordml" xmlns:w15="http://schemas.microsoft.com/office/word/2012/wordml" xmlns:w16cex="http://schemas.microsoft.com/office/word/2018/wordml/cex" xmlns:w16cid="http://schemas.microsoft.com/office/word/2016/wordml/cid" xmlns:w16="http://schemas.microsoft.com/office/word/2018/wordml" xmlns:w16du="http://schemas.microsoft.com/office/word/2023/wordml/word16du" xmlns:w16sdtdh="http://schemas.microsoft.com/office/word/2020/wordml/sdtdatahash" xmlns:w16sdtfl="http://schemas.microsoft.com/office/word/2024/wordml/sdtformatlock" xmlns:w16se="http://schemas.microsoft.com/office/word/2015/wordml/symex" xmlns:wpg="http://schemas.microsoft.com/office/word/2010/wordprocessingGroup" xmlns:wpi="http://schemas.microsoft.com/office/word/2010/wordprocessingInk" xmlns:wne="http://schemas.microsoft.com/office/word/2006/wordml" xmlns:wps="http://schemas.microsoft.com/office/word/2010/wordprocessingShape" mc:Ignorable="w14 w15 w16se w16cid w16 w16cex w16sdtdh w16sdtfl w16du wp14">
+<w:ftr xmlns:wpc="http://schemas.microsoft.com/office/word/2010/wordprocessingCanvas" xmlns:cx="http://schemas.microsoft.com/office/drawing/2014/chartex" xmlns:cx1="http://schemas.microsoft.com/office/drawing/2015/9/8/chartex" xmlns:cx2="http://schemas.microsoft.com/office/drawing/2015/10/21/chartex" xmlns:cx3="http://schemas.microsoft.com/office/drawing/2016/5/9/chartex" xmlns:cx4="http://schemas.microsoft.com/office/drawing/2016/5/10/chartex" xmlns:cx5="http://schemas.microsoft.com/office/drawing/2016/5/11/chartex" xmlns:cx6="http://schemas.microsoft.com/office/drawing/2016/5/12/chartex" xmlns:cx7="http://schemas.microsoft.com/office/drawing/2016/5/13/chartex" xmlns:cx8="http://schemas.microsoft.com/office/drawing/2016/5/14/chartex" xmlns:mc="http://schemas.openxmlformats.org/markup-compatibility/2006" xmlns:aink="http://schemas.microsoft.com/office/drawing/2016/ink" xmlns:am3d="http://schemas.microsoft.com/office/drawing/2017/model3d" xmlns:o="urn:schemas-microsoft-com:office:office" xmlns:oel="http://schemas.microsoft.com/office/2019/extlst" xmlns:r="http://schemas.openxmlformats.org/officeDocument/2006/relationships" xmlns:m="http://schemas.openxmlformats.org/officeDocument/2006/math" xmlns:v="urn:schemas-microsoft-com:vml" xmlns:wp14="http://schemas.microsoft.com/office/word/2010/wordprocessingDrawing" xmlns:wp="http://schemas.openxmlformats.org/drawingml/2006/wordprocessingDrawing" xmlns:w10="urn:schemas-microsoft-com:office:word" xmlns:w="http://schemas.openxmlformats.org/wordprocessingml/2006/main" xmlns:w14="http://schemas.microsoft.com/office/word/2010/wordml" xmlns:w15="http://schemas.microsoft.com/office/word/2012/wordml" xmlns:w16cei="http://schemas.microsoft.com/office/word/2026/wordml/cei" xmlns:w16cex="http://schemas.microsoft.com/office/word/2018/wordml/cex" xmlns:w16cid="http://schemas.microsoft.com/office/word/2016/wordml/cid" xmlns:w16="http://schemas.microsoft.com/office/word/2018/wordml" xmlns:w16du="http://schemas.microsoft.com/office/word/2023/wordml/word16du" xmlns:w16sdtdh="http://schemas.microsoft.com/office/word/2020/wordml/sdtdatahash" xmlns:w16sdtfl="http://schemas.microsoft.com/office/word/2024/wordml/sdtformatlock" xmlns:w16se="http://schemas.microsoft.com/office/word/2015/wordml/symex" xmlns:wpg="http://schemas.microsoft.com/office/word/2010/wordprocessingGroup" xmlns:wpi="http://schemas.microsoft.com/office/word/2010/wordprocessingInk" xmlns:wne="http://schemas.microsoft.com/office/word/2006/wordml" xmlns:wps="http://schemas.microsoft.com/office/word/2010/wordprocessingShape" mc:Ignorable="w14 w15 w16se w16cid w16 w16cex w16sdtdh w16sdtfl w16du wp14">
   <w:p>
     <w:pPr>
       <w:pStyle w:val="Footer"/>
@@ -3309,7 +3178,7 @@
 </file>
 
 <file path=word/footer3.xml><?xml version="1.0" encoding="utf-8"?>
-<w:ftr xmlns:wpc="http://schemas.microsoft.com/office/word/2010/wordprocessingCanvas" xmlns:cx="http://schemas.microsoft.com/office/drawing/2014/chartex" xmlns:cx1="http://schemas.microsoft.com/office/drawing/2015/9/8/chartex" xmlns:cx2="http://schemas.microsoft.com/office/drawing/2015/10/21/chartex" xmlns:cx3="http://schemas.microsoft.com/office/drawing/2016/5/9/chartex" xmlns:cx4="http://schemas.microsoft.com/office/drawing/2016/5/10/chartex" xmlns:cx5="http://schemas.microsoft.com/office/drawing/2016/5/11/chartex" xmlns:cx6="http://schemas.microsoft.com/office/drawing/2016/5/12/chartex" xmlns:cx7="http://schemas.microsoft.com/office/drawing/2016/5/13/chartex" xmlns:cx8="http://schemas.microsoft.com/office/drawing/2016/5/14/chartex" xmlns:mc="http://schemas.openxmlformats.org/markup-compatibility/2006" xmlns:aink="http://schemas.microsoft.com/office/drawing/2016/ink" xmlns:am3d="http://schemas.microsoft.com/office/drawing/2017/model3d" xmlns:o="urn:schemas-microsoft-com:office:office" xmlns:oel="http://schemas.microsoft.com/office/2019/extlst" xmlns:r="http://schemas.openxmlformats.org/officeDocument/2006/relationships" xmlns:m="http://schemas.openxmlformats.org/officeDocument/2006/math" xmlns:v="urn:schemas-microsoft-com:vml" xmlns:wp14="http://schemas.microsoft.com/office/word/2010/wordprocessingDrawing" xmlns:wp="http://schemas.openxmlformats.org/drawingml/2006/wordprocessingDrawing" xmlns:w10="urn:schemas-microsoft-com:office:word" xmlns:w="http://schemas.openxmlformats.org/wordprocessingml/2006/main" xmlns:w14="http://schemas.microsoft.com/office/word/2010/wordml" xmlns:w15="http://schemas.microsoft.com/office/word/2012/wordml" xmlns:w16cex="http://schemas.microsoft.com/office/word/2018/wordml/cex" xmlns:w16cid="http://schemas.microsoft.com/office/word/2016/wordml/cid" xmlns:w16="http://schemas.microsoft.com/office/word/2018/wordml" xmlns:w16du="http://schemas.microsoft.com/office/word/2023/wordml/word16du" xmlns:w16sdtdh="http://schemas.microsoft.com/office/word/2020/wordml/sdtdatahash" xmlns:w16sdtfl="http://schemas.microsoft.com/office/word/2024/wordml/sdtformatlock" xmlns:w16se="http://schemas.microsoft.com/office/word/2015/wordml/symex" xmlns:wpg="http://schemas.microsoft.com/office/word/2010/wordprocessingGroup" xmlns:wpi="http://schemas.microsoft.com/office/word/2010/wordprocessingInk" xmlns:wne="http://schemas.microsoft.com/office/word/2006/wordml" xmlns:wps="http://schemas.microsoft.com/office/word/2010/wordprocessingShape" mc:Ignorable="w14 w15 w16se w16cid w16 w16cex w16sdtdh w16sdtfl w16du wp14">
+<w:ftr xmlns:wpc="http://schemas.microsoft.com/office/word/2010/wordprocessingCanvas" xmlns:cx="http://schemas.microsoft.com/office/drawing/2014/chartex" xmlns:cx1="http://schemas.microsoft.com/office/drawing/2015/9/8/chartex" xmlns:cx2="http://schemas.microsoft.com/office/drawing/2015/10/21/chartex" xmlns:cx3="http://schemas.microsoft.com/office/drawing/2016/5/9/chartex" xmlns:cx4="http://schemas.microsoft.com/office/drawing/2016/5/10/chartex" xmlns:cx5="http://schemas.microsoft.com/office/drawing/2016/5/11/chartex" xmlns:cx6="http://schemas.microsoft.com/office/drawing/2016/5/12/chartex" xmlns:cx7="http://schemas.microsoft.com/office/drawing/2016/5/13/chartex" xmlns:cx8="http://schemas.microsoft.com/office/drawing/2016/5/14/chartex" xmlns:mc="http://schemas.openxmlformats.org/markup-compatibility/2006" xmlns:aink="http://schemas.microsoft.com/office/drawing/2016/ink" xmlns:am3d="http://schemas.microsoft.com/office/drawing/2017/model3d" xmlns:o="urn:schemas-microsoft-com:office:office" xmlns:oel="http://schemas.microsoft.com/office/2019/extlst" xmlns:r="http://schemas.openxmlformats.org/officeDocument/2006/relationships" xmlns:m="http://schemas.openxmlformats.org/officeDocument/2006/math" xmlns:v="urn:schemas-microsoft-com:vml" xmlns:wp14="http://schemas.microsoft.com/office/word/2010/wordprocessingDrawing" xmlns:wp="http://schemas.openxmlformats.org/drawingml/2006/wordprocessingDrawing" xmlns:w10="urn:schemas-microsoft-com:office:word" xmlns:w="http://schemas.openxmlformats.org/wordprocessingml/2006/main" xmlns:w14="http://schemas.microsoft.com/office/word/2010/wordml" xmlns:w15="http://schemas.microsoft.com/office/word/2012/wordml" xmlns:w16cei="http://schemas.microsoft.com/office/word/2026/wordml/cei" xmlns:w16cex="http://schemas.microsoft.com/office/word/2018/wordml/cex" xmlns:w16cid="http://schemas.microsoft.com/office/word/2016/wordml/cid" xmlns:w16="http://schemas.microsoft.com/office/word/2018/wordml" xmlns:w16du="http://schemas.microsoft.com/office/word/2023/wordml/word16du" xmlns:w16sdtdh="http://schemas.microsoft.com/office/word/2020/wordml/sdtdatahash" xmlns:w16sdtfl="http://schemas.microsoft.com/office/word/2024/wordml/sdtformatlock" xmlns:w16se="http://schemas.microsoft.com/office/word/2015/wordml/symex" xmlns:wpg="http://schemas.microsoft.com/office/word/2010/wordprocessingGroup" xmlns:wpi="http://schemas.microsoft.com/office/word/2010/wordprocessingInk" xmlns:wne="http://schemas.microsoft.com/office/word/2006/wordml" xmlns:wps="http://schemas.microsoft.com/office/word/2010/wordprocessingShape" mc:Ignorable="w14 w15 w16se w16cid w16 w16cex w16sdtdh w16sdtfl w16du wp14">
   <w:tbl>
     <w:tblPr>
       <w:tblW w:w="9657" w:type="dxa"/>
@@ -3397,7 +3266,7 @@
 </file>
 
 <file path=word/footnotes.xml><?xml version="1.0" encoding="utf-8"?>
-<w:footnotes xmlns:wpc="http://schemas.microsoft.com/office/word/2010/wordprocessingCanvas" xmlns:cx="http://schemas.microsoft.com/office/drawing/2014/chartex" xmlns:cx1="http://schemas.microsoft.com/office/drawing/2015/9/8/chartex" xmlns:cx2="http://schemas.microsoft.com/office/drawing/2015/10/21/chartex" xmlns:cx3="http://schemas.microsoft.com/office/drawing/2016/5/9/chartex" xmlns:cx4="http://schemas.microsoft.com/office/drawing/2016/5/10/chartex" xmlns:cx5="http://schemas.microsoft.com/office/drawing/2016/5/11/chartex" xmlns:cx6="http://schemas.microsoft.com/office/drawing/2016/5/12/chartex" xmlns:cx7="http://schemas.microsoft.com/office/drawing/2016/5/13/chartex" xmlns:cx8="http://schemas.microsoft.com/office/drawing/2016/5/14/chartex" xmlns:mc="http://schemas.openxmlformats.org/markup-compatibility/2006" xmlns:aink="http://schemas.microsoft.com/office/drawing/2016/ink" xmlns:am3d="http://schemas.microsoft.com/office/drawing/2017/model3d" xmlns:o="urn:schemas-microsoft-com:office:office" xmlns:oel="http://schemas.microsoft.com/office/2019/extlst" xmlns:r="http://schemas.openxmlformats.org/officeDocument/2006/relationships" xmlns:m="http://schemas.openxmlformats.org/officeDocument/2006/math" xmlns:v="urn:schemas-microsoft-com:vml" xmlns:wp14="http://schemas.microsoft.com/office/word/2010/wordprocessingDrawing" xmlns:wp="http://schemas.openxmlformats.org/drawingml/2006/wordprocessingDrawing" xmlns:w10="urn:schemas-microsoft-com:office:word" xmlns:w="http://schemas.openxmlformats.org/wordprocessingml/2006/main" xmlns:w14="http://schemas.microsoft.com/office/word/2010/wordml" xmlns:w15="http://schemas.microsoft.com/office/word/2012/wordml" xmlns:w16cex="http://schemas.microsoft.com/office/word/2018/wordml/cex" xmlns:w16cid="http://schemas.microsoft.com/office/word/2016/wordml/cid" xmlns:w16="http://schemas.microsoft.com/office/word/2018/wordml" xmlns:w16du="http://schemas.microsoft.com/office/word/2023/wordml/word16du" xmlns:w16sdtdh="http://schemas.microsoft.com/office/word/2020/wordml/sdtdatahash" xmlns:w16sdtfl="http://schemas.microsoft.com/office/word/2024/wordml/sdtformatlock" xmlns:w16se="http://schemas.microsoft.com/office/word/2015/wordml/symex" xmlns:wpg="http://schemas.microsoft.com/office/word/2010/wordprocessingGroup" xmlns:wpi="http://schemas.microsoft.com/office/word/2010/wordprocessingInk" xmlns:wne="http://schemas.microsoft.com/office/word/2006/wordml" xmlns:wps="http://schemas.microsoft.com/office/word/2010/wordprocessingShape" mc:Ignorable="w14 w15 w16se w16cid w16 w16cex w16sdtdh w16sdtfl w16du wp14">
+<w:footnotes xmlns:wpc="http://schemas.microsoft.com/office/word/2010/wordprocessingCanvas" xmlns:cx="http://schemas.microsoft.com/office/drawing/2014/chartex" xmlns:cx1="http://schemas.microsoft.com/office/drawing/2015/9/8/chartex" xmlns:cx2="http://schemas.microsoft.com/office/drawing/2015/10/21/chartex" xmlns:cx3="http://schemas.microsoft.com/office/drawing/2016/5/9/chartex" xmlns:cx4="http://schemas.microsoft.com/office/drawing/2016/5/10/chartex" xmlns:cx5="http://schemas.microsoft.com/office/drawing/2016/5/11/chartex" xmlns:cx6="http://schemas.microsoft.com/office/drawing/2016/5/12/chartex" xmlns:cx7="http://schemas.microsoft.com/office/drawing/2016/5/13/chartex" xmlns:cx8="http://schemas.microsoft.com/office/drawing/2016/5/14/chartex" xmlns:mc="http://schemas.openxmlformats.org/markup-compatibility/2006" xmlns:aink="http://schemas.microsoft.com/office/drawing/2016/ink" xmlns:am3d="http://schemas.microsoft.com/office/drawing/2017/model3d" xmlns:o="urn:schemas-microsoft-com:office:office" xmlns:oel="http://schemas.microsoft.com/office/2019/extlst" xmlns:r="http://schemas.openxmlformats.org/officeDocument/2006/relationships" xmlns:m="http://schemas.openxmlformats.org/officeDocument/2006/math" xmlns:v="urn:schemas-microsoft-com:vml" xmlns:wp14="http://schemas.microsoft.com/office/word/2010/wordprocessingDrawing" xmlns:wp="http://schemas.openxmlformats.org/drawingml/2006/wordprocessingDrawing" xmlns:w10="urn:schemas-microsoft-com:office:word" xmlns:w="http://schemas.openxmlformats.org/wordprocessingml/2006/main" xmlns:w14="http://schemas.microsoft.com/office/word/2010/wordml" xmlns:w15="http://schemas.microsoft.com/office/word/2012/wordml" xmlns:w16cei="http://schemas.microsoft.com/office/word/2026/wordml/cei" xmlns:w16cex="http://schemas.microsoft.com/office/word/2018/wordml/cex" xmlns:w16cid="http://schemas.microsoft.com/office/word/2016/wordml/cid" xmlns:w16="http://schemas.microsoft.com/office/word/2018/wordml" xmlns:w16du="http://schemas.microsoft.com/office/word/2023/wordml/word16du" xmlns:w16sdtdh="http://schemas.microsoft.com/office/word/2020/wordml/sdtdatahash" xmlns:w16sdtfl="http://schemas.microsoft.com/office/word/2024/wordml/sdtformatlock" xmlns:w16se="http://schemas.microsoft.com/office/word/2015/wordml/symex" xmlns:wpg="http://schemas.microsoft.com/office/word/2010/wordprocessingGroup" xmlns:wpi="http://schemas.microsoft.com/office/word/2010/wordprocessingInk" xmlns:wne="http://schemas.microsoft.com/office/word/2006/wordml" xmlns:wps="http://schemas.microsoft.com/office/word/2010/wordprocessingShape" mc:Ignorable="w14 w15 w16se w16cid w16 w16cex w16sdtdh w16sdtfl w16du wp14">
   <w:footnote w:type="separator" w:id="-1">
     <w:p>
       <w:pPr>
@@ -3422,7 +3291,7 @@
 </file>
 
 <file path=word/header1.xml><?xml version="1.0" encoding="utf-8"?>
-<w:hdr xmlns:wpc="http://schemas.microsoft.com/office/word/2010/wordprocessingCanvas" xmlns:cx="http://schemas.microsoft.com/office/drawing/2014/chartex" xmlns:cx1="http://schemas.microsoft.com/office/drawing/2015/9/8/chartex" xmlns:cx2="http://schemas.microsoft.com/office/drawing/2015/10/21/chartex" xmlns:cx3="http://schemas.microsoft.com/office/drawing/2016/5/9/chartex" xmlns:cx4="http://schemas.microsoft.com/office/drawing/2016/5/10/chartex" xmlns:cx5="http://schemas.microsoft.com/office/drawing/2016/5/11/chartex" xmlns:cx6="http://schemas.microsoft.com/office/drawing/2016/5/12/chartex" xmlns:cx7="http://schemas.microsoft.com/office/drawing/2016/5/13/chartex" xmlns:cx8="http://schemas.microsoft.com/office/drawing/2016/5/14/chartex" xmlns:mc="http://schemas.openxmlformats.org/markup-compatibility/2006" xmlns:aink="http://schemas.microsoft.com/office/drawing/2016/ink" xmlns:am3d="http://schemas.microsoft.com/office/drawing/2017/model3d" xmlns:o="urn:schemas-microsoft-com:office:office" xmlns:oel="http://schemas.microsoft.com/office/2019/extlst" xmlns:r="http://schemas.openxmlformats.org/officeDocument/2006/relationships" xmlns:m="http://schemas.openxmlformats.org/officeDocument/2006/math" xmlns:v="urn:schemas-microsoft-com:vml" xmlns:wp14="http://schemas.microsoft.com/office/word/2010/wordprocessingDrawing" xmlns:wp="http://schemas.openxmlformats.org/drawingml/2006/wordprocessingDrawing" xmlns:w10="urn:schemas-microsoft-com:office:word" xmlns:w="http://schemas.openxmlformats.org/wordprocessingml/2006/main" xmlns:w14="http://schemas.microsoft.com/office/word/2010/wordml" xmlns:w15="http://schemas.microsoft.com/office/word/2012/wordml" xmlns:w16cex="http://schemas.microsoft.com/office/word/2018/wordml/cex" xmlns:w16cid="http://schemas.microsoft.com/office/word/2016/wordml/cid" xmlns:w16="http://schemas.microsoft.com/office/word/2018/wordml" xmlns:w16du="http://schemas.microsoft.com/office/word/2023/wordml/word16du" xmlns:w16sdtdh="http://schemas.microsoft.com/office/word/2020/wordml/sdtdatahash" xmlns:w16sdtfl="http://schemas.microsoft.com/office/word/2024/wordml/sdtformatlock" xmlns:w16se="http://schemas.microsoft.com/office/word/2015/wordml/symex" xmlns:wpg="http://schemas.microsoft.com/office/word/2010/wordprocessingGroup" xmlns:wpi="http://schemas.microsoft.com/office/word/2010/wordprocessingInk" xmlns:wne="http://schemas.microsoft.com/office/word/2006/wordml" xmlns:wps="http://schemas.microsoft.com/office/word/2010/wordprocessingShape" mc:Ignorable="w14 w15 w16se w16cid w16 w16cex w16sdtdh w16sdtfl w16du wp14">
+<w:hdr xmlns:wpc="http://schemas.microsoft.com/office/word/2010/wordprocessingCanvas" xmlns:cx="http://schemas.microsoft.com/office/drawing/2014/chartex" xmlns:cx1="http://schemas.microsoft.com/office/drawing/2015/9/8/chartex" xmlns:cx2="http://schemas.microsoft.com/office/drawing/2015/10/21/chartex" xmlns:cx3="http://schemas.microsoft.com/office/drawing/2016/5/9/chartex" xmlns:cx4="http://schemas.microsoft.com/office/drawing/2016/5/10/chartex" xmlns:cx5="http://schemas.microsoft.com/office/drawing/2016/5/11/chartex" xmlns:cx6="http://schemas.microsoft.com/office/drawing/2016/5/12/chartex" xmlns:cx7="http://schemas.microsoft.com/office/drawing/2016/5/13/chartex" xmlns:cx8="http://schemas.microsoft.com/office/drawing/2016/5/14/chartex" xmlns:mc="http://schemas.openxmlformats.org/markup-compatibility/2006" xmlns:aink="http://schemas.microsoft.com/office/drawing/2016/ink" xmlns:am3d="http://schemas.microsoft.com/office/drawing/2017/model3d" xmlns:o="urn:schemas-microsoft-com:office:office" xmlns:oel="http://schemas.microsoft.com/office/2019/extlst" xmlns:r="http://schemas.openxmlformats.org/officeDocument/2006/relationships" xmlns:m="http://schemas.openxmlformats.org/officeDocument/2006/math" xmlns:v="urn:schemas-microsoft-com:vml" xmlns:wp14="http://schemas.microsoft.com/office/word/2010/wordprocessingDrawing" xmlns:wp="http://schemas.openxmlformats.org/drawingml/2006/wordprocessingDrawing" xmlns:w10="urn:schemas-microsoft-com:office:word" xmlns:w="http://schemas.openxmlformats.org/wordprocessingml/2006/main" xmlns:w14="http://schemas.microsoft.com/office/word/2010/wordml" xmlns:w15="http://schemas.microsoft.com/office/word/2012/wordml" xmlns:w16cei="http://schemas.microsoft.com/office/word/2026/wordml/cei" xmlns:w16cex="http://schemas.microsoft.com/office/word/2018/wordml/cex" xmlns:w16cid="http://schemas.microsoft.com/office/word/2016/wordml/cid" xmlns:w16="http://schemas.microsoft.com/office/word/2018/wordml" xmlns:w16du="http://schemas.microsoft.com/office/word/2023/wordml/word16du" xmlns:w16sdtdh="http://schemas.microsoft.com/office/word/2020/wordml/sdtdatahash" xmlns:w16sdtfl="http://schemas.microsoft.com/office/word/2024/wordml/sdtformatlock" xmlns:w16se="http://schemas.microsoft.com/office/word/2015/wordml/symex" xmlns:wpg="http://schemas.microsoft.com/office/word/2010/wordprocessingGroup" xmlns:wpi="http://schemas.microsoft.com/office/word/2010/wordprocessingInk" xmlns:wne="http://schemas.microsoft.com/office/word/2006/wordml" xmlns:wps="http://schemas.microsoft.com/office/word/2010/wordprocessingShape" mc:Ignorable="w14 w15 w16se w16cid w16 w16cex w16sdtdh w16sdtfl w16du wp14">
   <w:p>
     <w:pPr>
       <w:pStyle w:val="Header"/>
@@ -3432,7 +3301,7 @@
 </file>
 
 <file path=word/header2.xml><?xml version="1.0" encoding="utf-8"?>
-<w:hdr xmlns:wpc="http://schemas.microsoft.com/office/word/2010/wordprocessingCanvas" xmlns:cx="http://schemas.microsoft.com/office/drawing/2014/chartex" xmlns:cx1="http://schemas.microsoft.com/office/drawing/2015/9/8/chartex" xmlns:cx2="http://schemas.microsoft.com/office/drawing/2015/10/21/chartex" xmlns:cx3="http://schemas.microsoft.com/office/drawing/2016/5/9/chartex" xmlns:cx4="http://schemas.microsoft.com/office/drawing/2016/5/10/chartex" xmlns:cx5="http://schemas.microsoft.com/office/drawing/2016/5/11/chartex" xmlns:cx6="http://schemas.microsoft.com/office/drawing/2016/5/12/chartex" xmlns:cx7="http://schemas.microsoft.com/office/drawing/2016/5/13/chartex" xmlns:cx8="http://schemas.microsoft.com/office/drawing/2016/5/14/chartex" xmlns:mc="http://schemas.openxmlformats.org/markup-compatibility/2006" xmlns:aink="http://schemas.microsoft.com/office/drawing/2016/ink" xmlns:am3d="http://schemas.microsoft.com/office/drawing/2017/model3d" xmlns:o="urn:schemas-microsoft-com:office:office" xmlns:oel="http://schemas.microsoft.com/office/2019/extlst" xmlns:r="http://schemas.openxmlformats.org/officeDocument/2006/relationships" xmlns:m="http://schemas.openxmlformats.org/officeDocument/2006/math" xmlns:v="urn:schemas-microsoft-com:vml" xmlns:wp14="http://schemas.microsoft.com/office/word/2010/wordprocessingDrawing" xmlns:wp="http://schemas.openxmlformats.org/drawingml/2006/wordprocessingDrawing" xmlns:w10="urn:schemas-microsoft-com:office:word" xmlns:w="http://schemas.openxmlformats.org/wordprocessingml/2006/main" xmlns:w14="http://schemas.microsoft.com/office/word/2010/wordml" xmlns:w15="http://schemas.microsoft.com/office/word/2012/wordml" xmlns:w16cex="http://schemas.microsoft.com/office/word/2018/wordml/cex" xmlns:w16cid="http://schemas.microsoft.com/office/word/2016/wordml/cid" xmlns:w16="http://schemas.microsoft.com/office/word/2018/wordml" xmlns:w16du="http://schemas.microsoft.com/office/word/2023/wordml/word16du" xmlns:w16sdtdh="http://schemas.microsoft.com/office/word/2020/wordml/sdtdatahash" xmlns:w16sdtfl="http://schemas.microsoft.com/office/word/2024/wordml/sdtformatlock" xmlns:w16se="http://schemas.microsoft.com/office/word/2015/wordml/symex" xmlns:wpg="http://schemas.microsoft.com/office/word/2010/wordprocessingGroup" xmlns:wpi="http://schemas.microsoft.com/office/word/2010/wordprocessingInk" xmlns:wne="http://schemas.microsoft.com/office/word/2006/wordml" xmlns:wps="http://schemas.microsoft.com/office/word/2010/wordprocessingShape" mc:Ignorable="w14 w15 w16se w16cid w16 w16cex w16sdtdh w16sdtfl w16du wp14">
+<w:hdr xmlns:wpc="http://schemas.microsoft.com/office/word/2010/wordprocessingCanvas" xmlns:cx="http://schemas.microsoft.com/office/drawing/2014/chartex" xmlns:cx1="http://schemas.microsoft.com/office/drawing/2015/9/8/chartex" xmlns:cx2="http://schemas.microsoft.com/office/drawing/2015/10/21/chartex" xmlns:cx3="http://schemas.microsoft.com/office/drawing/2016/5/9/chartex" xmlns:cx4="http://schemas.microsoft.com/office/drawing/2016/5/10/chartex" xmlns:cx5="http://schemas.microsoft.com/office/drawing/2016/5/11/chartex" xmlns:cx6="http://schemas.microsoft.com/office/drawing/2016/5/12/chartex" xmlns:cx7="http://schemas.microsoft.com/office/drawing/2016/5/13/chartex" xmlns:cx8="http://schemas.microsoft.com/office/drawing/2016/5/14/chartex" xmlns:mc="http://schemas.openxmlformats.org/markup-compatibility/2006" xmlns:aink="http://schemas.microsoft.com/office/drawing/2016/ink" xmlns:am3d="http://schemas.microsoft.com/office/drawing/2017/model3d" xmlns:o="urn:schemas-microsoft-com:office:office" xmlns:oel="http://schemas.microsoft.com/office/2019/extlst" xmlns:r="http://schemas.openxmlformats.org/officeDocument/2006/relationships" xmlns:m="http://schemas.openxmlformats.org/officeDocument/2006/math" xmlns:v="urn:schemas-microsoft-com:vml" xmlns:wp14="http://schemas.microsoft.com/office/word/2010/wordprocessingDrawing" xmlns:wp="http://schemas.openxmlformats.org/drawingml/2006/wordprocessingDrawing" xmlns:w10="urn:schemas-microsoft-com:office:word" xmlns:w="http://schemas.openxmlformats.org/wordprocessingml/2006/main" xmlns:w14="http://schemas.microsoft.com/office/word/2010/wordml" xmlns:w15="http://schemas.microsoft.com/office/word/2012/wordml" xmlns:w16cei="http://schemas.microsoft.com/office/word/2026/wordml/cei" xmlns:w16cex="http://schemas.microsoft.com/office/word/2018/wordml/cex" xmlns:w16cid="http://schemas.microsoft.com/office/word/2016/wordml/cid" xmlns:w16="http://schemas.microsoft.com/office/word/2018/wordml" xmlns:w16du="http://schemas.microsoft.com/office/word/2023/wordml/word16du" xmlns:w16sdtdh="http://schemas.microsoft.com/office/word/2020/wordml/sdtdatahash" xmlns:w16sdtfl="http://schemas.microsoft.com/office/word/2024/wordml/sdtformatlock" xmlns:w16se="http://schemas.microsoft.com/office/word/2015/wordml/symex" xmlns:wpg="http://schemas.microsoft.com/office/word/2010/wordprocessingGroup" xmlns:wpi="http://schemas.microsoft.com/office/word/2010/wordprocessingInk" xmlns:wne="http://schemas.microsoft.com/office/word/2006/wordml" xmlns:wps="http://schemas.microsoft.com/office/word/2010/wordprocessingShape" mc:Ignorable="w14 w15 w16se w16cid w16 w16cex w16sdtdh w16sdtfl w16du wp14">
   <w:tbl>
     <w:tblPr>
       <w:tblW w:w="9450" w:type="dxa"/>
@@ -3618,7 +3487,7 @@
 </file>
 
 <file path=word/header3.xml><?xml version="1.0" encoding="utf-8"?>
-<w:hdr xmlns:wpc="http://schemas.microsoft.com/office/word/2010/wordprocessingCanvas" xmlns:cx="http://schemas.microsoft.com/office/drawing/2014/chartex" xmlns:cx1="http://schemas.microsoft.com/office/drawing/2015/9/8/chartex" xmlns:cx2="http://schemas.microsoft.com/office/drawing/2015/10/21/chartex" xmlns:cx3="http://schemas.microsoft.com/office/drawing/2016/5/9/chartex" xmlns:cx4="http://schemas.microsoft.com/office/drawing/2016/5/10/chartex" xmlns:cx5="http://schemas.microsoft.com/office/drawing/2016/5/11/chartex" xmlns:cx6="http://schemas.microsoft.com/office/drawing/2016/5/12/chartex" xmlns:cx7="http://schemas.microsoft.com/office/drawing/2016/5/13/chartex" xmlns:cx8="http://schemas.microsoft.com/office/drawing/2016/5/14/chartex" xmlns:mc="http://schemas.openxmlformats.org/markup-compatibility/2006" xmlns:aink="http://schemas.microsoft.com/office/drawing/2016/ink" xmlns:am3d="http://schemas.microsoft.com/office/drawing/2017/model3d" xmlns:o="urn:schemas-microsoft-com:office:office" xmlns:oel="http://schemas.microsoft.com/office/2019/extlst" xmlns:r="http://schemas.openxmlformats.org/officeDocument/2006/relationships" xmlns:m="http://schemas.openxmlformats.org/officeDocument/2006/math" xmlns:v="urn:schemas-microsoft-com:vml" xmlns:wp14="http://schemas.microsoft.com/office/word/2010/wordprocessingDrawing" xmlns:wp="http://schemas.openxmlformats.org/drawingml/2006/wordprocessingDrawing" xmlns:w10="urn:schemas-microsoft-com:office:word" xmlns:w="http://schemas.openxmlformats.org/wordprocessingml/2006/main" xmlns:w14="http://schemas.microsoft.com/office/word/2010/wordml" xmlns:w15="http://schemas.microsoft.com/office/word/2012/wordml" xmlns:w16cex="http://schemas.microsoft.com/office/word/2018/wordml/cex" xmlns:w16cid="http://schemas.microsoft.com/office/word/2016/wordml/cid" xmlns:w16="http://schemas.microsoft.com/office/word/2018/wordml" xmlns:w16du="http://schemas.microsoft.com/office/word/2023/wordml/word16du" xmlns:w16sdtdh="http://schemas.microsoft.com/office/word/2020/wordml/sdtdatahash" xmlns:w16sdtfl="http://schemas.microsoft.com/office/word/2024/wordml/sdtformatlock" xmlns:w16se="http://schemas.microsoft.com/office/word/2015/wordml/symex" xmlns:wpg="http://schemas.microsoft.com/office/word/2010/wordprocessingGroup" xmlns:wpi="http://schemas.microsoft.com/office/word/2010/wordprocessingInk" xmlns:wne="http://schemas.microsoft.com/office/word/2006/wordml" xmlns:wps="http://schemas.microsoft.com/office/word/2010/wordprocessingShape" mc:Ignorable="w14 w15 w16se w16cid w16 w16cex w16sdtdh w16sdtfl w16du wp14">
+<w:hdr xmlns:wpc="http://schemas.microsoft.com/office/word/2010/wordprocessingCanvas" xmlns:cx="http://schemas.microsoft.com/office/drawing/2014/chartex" xmlns:cx1="http://schemas.microsoft.com/office/drawing/2015/9/8/chartex" xmlns:cx2="http://schemas.microsoft.com/office/drawing/2015/10/21/chartex" xmlns:cx3="http://schemas.microsoft.com/office/drawing/2016/5/9/chartex" xmlns:cx4="http://schemas.microsoft.com/office/drawing/2016/5/10/chartex" xmlns:cx5="http://schemas.microsoft.com/office/drawing/2016/5/11/chartex" xmlns:cx6="http://schemas.microsoft.com/office/drawing/2016/5/12/chartex" xmlns:cx7="http://schemas.microsoft.com/office/drawing/2016/5/13/chartex" xmlns:cx8="http://schemas.microsoft.com/office/drawing/2016/5/14/chartex" xmlns:mc="http://schemas.openxmlformats.org/markup-compatibility/2006" xmlns:aink="http://schemas.microsoft.com/office/drawing/2016/ink" xmlns:am3d="http://schemas.microsoft.com/office/drawing/2017/model3d" xmlns:o="urn:schemas-microsoft-com:office:office" xmlns:oel="http://schemas.microsoft.com/office/2019/extlst" xmlns:r="http://schemas.openxmlformats.org/officeDocument/2006/relationships" xmlns:m="http://schemas.openxmlformats.org/officeDocument/2006/math" xmlns:v="urn:schemas-microsoft-com:vml" xmlns:wp14="http://schemas.microsoft.com/office/word/2010/wordprocessingDrawing" xmlns:wp="http://schemas.openxmlformats.org/drawingml/2006/wordprocessingDrawing" xmlns:w10="urn:schemas-microsoft-com:office:word" xmlns:w="http://schemas.openxmlformats.org/wordprocessingml/2006/main" xmlns:w14="http://schemas.microsoft.com/office/word/2010/wordml" xmlns:w15="http://schemas.microsoft.com/office/word/2012/wordml" xmlns:w16cei="http://schemas.microsoft.com/office/word/2026/wordml/cei" xmlns:w16cex="http://schemas.microsoft.com/office/word/2018/wordml/cex" xmlns:w16cid="http://schemas.microsoft.com/office/word/2016/wordml/cid" xmlns:w16="http://schemas.microsoft.com/office/word/2018/wordml" xmlns:w16du="http://schemas.microsoft.com/office/word/2023/wordml/word16du" xmlns:w16sdtdh="http://schemas.microsoft.com/office/word/2020/wordml/sdtdatahash" xmlns:w16sdtfl="http://schemas.microsoft.com/office/word/2024/wordml/sdtformatlock" xmlns:w16se="http://schemas.microsoft.com/office/word/2015/wordml/symex" xmlns:wpg="http://schemas.microsoft.com/office/word/2010/wordprocessingGroup" xmlns:wpi="http://schemas.microsoft.com/office/word/2010/wordprocessingInk" xmlns:wne="http://schemas.microsoft.com/office/word/2006/wordml" xmlns:wps="http://schemas.microsoft.com/office/word/2010/wordprocessingShape" mc:Ignorable="w14 w15 w16se w16cid w16 w16cex w16sdtdh w16sdtfl w16du wp14">
   <w:p>
     <w:pPr>
       <w:spacing w:line="240" w:lineRule="auto"/>
@@ -3634,13 +3503,13 @@
   </w:p>
   <w:tbl>
     <w:tblPr>
-      <w:tblW w:w="9450" w:type="dxa"/>
+      <w:tblW w:w="9440" w:type="dxa"/>
       <w:tblInd w:w="5" w:type="dxa"/>
       <w:tblBorders>
-        <w:top w:val="single" w:sz="4" w:space="0" w:color="002060"/>
-        <w:left w:val="single" w:sz="4" w:space="0" w:color="002060"/>
-        <w:bottom w:val="single" w:sz="4" w:space="0" w:color="002060"/>
-        <w:right w:val="single" w:sz="4" w:space="0" w:color="002060"/>
+        <w:top w:val="single" w:sz="4" w:space="0" w:color="002641"/>
+        <w:left w:val="single" w:sz="4" w:space="0" w:color="002641"/>
+        <w:bottom w:val="single" w:sz="4" w:space="0" w:color="002641"/>
+        <w:right w:val="single" w:sz="4" w:space="0" w:color="002641"/>
         <w:insideH w:val="single" w:sz="4" w:space="0" w:color="002060"/>
         <w:insideV w:val="single" w:sz="4" w:space="0" w:color="002060"/>
       </w:tblBorders>
@@ -3652,12 +3521,12 @@
     </w:tblPr>
     <w:tblGrid>
       <w:gridCol w:w="1601"/>
-      <w:gridCol w:w="7849"/>
+      <w:gridCol w:w="7839"/>
     </w:tblGrid>
     <w:tr>
       <w:tc>
         <w:tcPr>
-          <w:tcW w:w="1594" w:type="dxa"/>
+          <w:tcW w:w="1591" w:type="dxa"/>
         </w:tcPr>
         <w:p>
           <w:pPr>
@@ -3729,7 +3598,7 @@
       </w:tc>
       <w:tc>
         <w:tcPr>
-          <w:tcW w:w="7856" w:type="dxa"/>
+          <w:tcW w:w="7849" w:type="dxa"/>
           <w:vAlign w:val="center"/>
         </w:tcPr>
         <w:p>
@@ -3815,7 +3684,7 @@
 </file>
 
 <file path=word/header4.xml><?xml version="1.0" encoding="utf-8"?>
-<w:hdr xmlns:wpc="http://schemas.microsoft.com/office/word/2010/wordprocessingCanvas" xmlns:cx="http://schemas.microsoft.com/office/drawing/2014/chartex" xmlns:cx1="http://schemas.microsoft.com/office/drawing/2015/9/8/chartex" xmlns:cx2="http://schemas.microsoft.com/office/drawing/2015/10/21/chartex" xmlns:cx3="http://schemas.microsoft.com/office/drawing/2016/5/9/chartex" xmlns:cx4="http://schemas.microsoft.com/office/drawing/2016/5/10/chartex" xmlns:cx5="http://schemas.microsoft.com/office/drawing/2016/5/11/chartex" xmlns:cx6="http://schemas.microsoft.com/office/drawing/2016/5/12/chartex" xmlns:cx7="http://schemas.microsoft.com/office/drawing/2016/5/13/chartex" xmlns:cx8="http://schemas.microsoft.com/office/drawing/2016/5/14/chartex" xmlns:mc="http://schemas.openxmlformats.org/markup-compatibility/2006" xmlns:aink="http://schemas.microsoft.com/office/drawing/2016/ink" xmlns:am3d="http://schemas.microsoft.com/office/drawing/2017/model3d" xmlns:o="urn:schemas-microsoft-com:office:office" xmlns:oel="http://schemas.microsoft.com/office/2019/extlst" xmlns:r="http://schemas.openxmlformats.org/officeDocument/2006/relationships" xmlns:m="http://schemas.openxmlformats.org/officeDocument/2006/math" xmlns:v="urn:schemas-microsoft-com:vml" xmlns:wp14="http://schemas.microsoft.com/office/word/2010/wordprocessingDrawing" xmlns:wp="http://schemas.openxmlformats.org/drawingml/2006/wordprocessingDrawing" xmlns:w10="urn:schemas-microsoft-com:office:word" xmlns:w="http://schemas.openxmlformats.org/wordprocessingml/2006/main" xmlns:w14="http://schemas.microsoft.com/office/word/2010/wordml" xmlns:w15="http://schemas.microsoft.com/office/word/2012/wordml" xmlns:w16cex="http://schemas.microsoft.com/office/word/2018/wordml/cex" xmlns:w16cid="http://schemas.microsoft.com/office/word/2016/wordml/cid" xmlns:w16="http://schemas.microsoft.com/office/word/2018/wordml" xmlns:w16du="http://schemas.microsoft.com/office/word/2023/wordml/word16du" xmlns:w16sdtdh="http://schemas.microsoft.com/office/word/2020/wordml/sdtdatahash" xmlns:w16sdtfl="http://schemas.microsoft.com/office/word/2024/wordml/sdtformatlock" xmlns:w16se="http://schemas.microsoft.com/office/word/2015/wordml/symex" xmlns:wpg="http://schemas.microsoft.com/office/word/2010/wordprocessingGroup" xmlns:wpi="http://schemas.microsoft.com/office/word/2010/wordprocessingInk" xmlns:wne="http://schemas.microsoft.com/office/word/2006/wordml" xmlns:wps="http://schemas.microsoft.com/office/word/2010/wordprocessingShape" mc:Ignorable="w14 w15 w16se w16cid w16 w16cex w16sdtdh w16sdtfl w16du wp14">
+<w:hdr xmlns:wpc="http://schemas.microsoft.com/office/word/2010/wordprocessingCanvas" xmlns:cx="http://schemas.microsoft.com/office/drawing/2014/chartex" xmlns:cx1="http://schemas.microsoft.com/office/drawing/2015/9/8/chartex" xmlns:cx2="http://schemas.microsoft.com/office/drawing/2015/10/21/chartex" xmlns:cx3="http://schemas.microsoft.com/office/drawing/2016/5/9/chartex" xmlns:cx4="http://schemas.microsoft.com/office/drawing/2016/5/10/chartex" xmlns:cx5="http://schemas.microsoft.com/office/drawing/2016/5/11/chartex" xmlns:cx6="http://schemas.microsoft.com/office/drawing/2016/5/12/chartex" xmlns:cx7="http://schemas.microsoft.com/office/drawing/2016/5/13/chartex" xmlns:cx8="http://schemas.microsoft.com/office/drawing/2016/5/14/chartex" xmlns:mc="http://schemas.openxmlformats.org/markup-compatibility/2006" xmlns:aink="http://schemas.microsoft.com/office/drawing/2016/ink" xmlns:am3d="http://schemas.microsoft.com/office/drawing/2017/model3d" xmlns:o="urn:schemas-microsoft-com:office:office" xmlns:oel="http://schemas.microsoft.com/office/2019/extlst" xmlns:r="http://schemas.openxmlformats.org/officeDocument/2006/relationships" xmlns:m="http://schemas.openxmlformats.org/officeDocument/2006/math" xmlns:v="urn:schemas-microsoft-com:vml" xmlns:wp14="http://schemas.microsoft.com/office/word/2010/wordprocessingDrawing" xmlns:wp="http://schemas.openxmlformats.org/drawingml/2006/wordprocessingDrawing" xmlns:w10="urn:schemas-microsoft-com:office:word" xmlns:w="http://schemas.openxmlformats.org/wordprocessingml/2006/main" xmlns:w14="http://schemas.microsoft.com/office/word/2010/wordml" xmlns:w15="http://schemas.microsoft.com/office/word/2012/wordml" xmlns:w16cei="http://schemas.microsoft.com/office/word/2026/wordml/cei" xmlns:w16cex="http://schemas.microsoft.com/office/word/2018/wordml/cex" xmlns:w16cid="http://schemas.microsoft.com/office/word/2016/wordml/cid" xmlns:w16="http://schemas.microsoft.com/office/word/2018/wordml" xmlns:w16du="http://schemas.microsoft.com/office/word/2023/wordml/word16du" xmlns:w16sdtdh="http://schemas.microsoft.com/office/word/2020/wordml/sdtdatahash" xmlns:w16sdtfl="http://schemas.microsoft.com/office/word/2024/wordml/sdtformatlock" xmlns:w16se="http://schemas.microsoft.com/office/word/2015/wordml/symex" xmlns:wpg="http://schemas.microsoft.com/office/word/2010/wordprocessingGroup" xmlns:wpi="http://schemas.microsoft.com/office/word/2010/wordprocessingInk" xmlns:wne="http://schemas.microsoft.com/office/word/2006/wordml" xmlns:wps="http://schemas.microsoft.com/office/word/2010/wordprocessingShape" mc:Ignorable="w14 w15 w16se w16cid w16 w16cex w16sdtdh w16sdtfl w16du wp14">
   <w:p>
     <w:pPr>
       <w:tabs>
@@ -3833,7 +3702,7 @@
 </file>
 
 <file path=word/header5.xml><?xml version="1.0" encoding="utf-8"?>
-<w:hdr xmlns:wpc="http://schemas.microsoft.com/office/word/2010/wordprocessingCanvas" xmlns:cx="http://schemas.microsoft.com/office/drawing/2014/chartex" xmlns:cx1="http://schemas.microsoft.com/office/drawing/2015/9/8/chartex" xmlns:cx2="http://schemas.microsoft.com/office/drawing/2015/10/21/chartex" xmlns:cx3="http://schemas.microsoft.com/office/drawing/2016/5/9/chartex" xmlns:cx4="http://schemas.microsoft.com/office/drawing/2016/5/10/chartex" xmlns:cx5="http://schemas.microsoft.com/office/drawing/2016/5/11/chartex" xmlns:cx6="http://schemas.microsoft.com/office/drawing/2016/5/12/chartex" xmlns:cx7="http://schemas.microsoft.com/office/drawing/2016/5/13/chartex" xmlns:cx8="http://schemas.microsoft.com/office/drawing/2016/5/14/chartex" xmlns:mc="http://schemas.openxmlformats.org/markup-compatibility/2006" xmlns:aink="http://schemas.microsoft.com/office/drawing/2016/ink" xmlns:am3d="http://schemas.microsoft.com/office/drawing/2017/model3d" xmlns:o="urn:schemas-microsoft-com:office:office" xmlns:oel="http://schemas.microsoft.com/office/2019/extlst" xmlns:r="http://schemas.openxmlformats.org/officeDocument/2006/relationships" xmlns:m="http://schemas.openxmlformats.org/officeDocument/2006/math" xmlns:v="urn:schemas-microsoft-com:vml" xmlns:wp14="http://schemas.microsoft.com/office/word/2010/wordprocessingDrawing" xmlns:wp="http://schemas.openxmlformats.org/drawingml/2006/wordprocessingDrawing" xmlns:w10="urn:schemas-microsoft-com:office:word" xmlns:w="http://schemas.openxmlformats.org/wordprocessingml/2006/main" xmlns:w14="http://schemas.microsoft.com/office/word/2010/wordml" xmlns:w15="http://schemas.microsoft.com/office/word/2012/wordml" xmlns:w16cex="http://schemas.microsoft.com/office/word/2018/wordml/cex" xmlns:w16cid="http://schemas.microsoft.com/office/word/2016/wordml/cid" xmlns:w16="http://schemas.microsoft.com/office/word/2018/wordml" xmlns:w16du="http://schemas.microsoft.com/office/word/2023/wordml/word16du" xmlns:w16sdtdh="http://schemas.microsoft.com/office/word/2020/wordml/sdtdatahash" xmlns:w16sdtfl="http://schemas.microsoft.com/office/word/2024/wordml/sdtformatlock" xmlns:w16se="http://schemas.microsoft.com/office/word/2015/wordml/symex" xmlns:wpg="http://schemas.microsoft.com/office/word/2010/wordprocessingGroup" xmlns:wpi="http://schemas.microsoft.com/office/word/2010/wordprocessingInk" xmlns:wne="http://schemas.microsoft.com/office/word/2006/wordml" xmlns:wps="http://schemas.microsoft.com/office/word/2010/wordprocessingShape" mc:Ignorable="w14 w15 w16se w16cid w16 w16cex w16sdtdh w16sdtfl w16du wp14">
+<w:hdr xmlns:wpc="http://schemas.microsoft.com/office/word/2010/wordprocessingCanvas" xmlns:cx="http://schemas.microsoft.com/office/drawing/2014/chartex" xmlns:cx1="http://schemas.microsoft.com/office/drawing/2015/9/8/chartex" xmlns:cx2="http://schemas.microsoft.com/office/drawing/2015/10/21/chartex" xmlns:cx3="http://schemas.microsoft.com/office/drawing/2016/5/9/chartex" xmlns:cx4="http://schemas.microsoft.com/office/drawing/2016/5/10/chartex" xmlns:cx5="http://schemas.microsoft.com/office/drawing/2016/5/11/chartex" xmlns:cx6="http://schemas.microsoft.com/office/drawing/2016/5/12/chartex" xmlns:cx7="http://schemas.microsoft.com/office/drawing/2016/5/13/chartex" xmlns:cx8="http://schemas.microsoft.com/office/drawing/2016/5/14/chartex" xmlns:mc="http://schemas.openxmlformats.org/markup-compatibility/2006" xmlns:aink="http://schemas.microsoft.com/office/drawing/2016/ink" xmlns:am3d="http://schemas.microsoft.com/office/drawing/2017/model3d" xmlns:o="urn:schemas-microsoft-com:office:office" xmlns:oel="http://schemas.microsoft.com/office/2019/extlst" xmlns:r="http://schemas.openxmlformats.org/officeDocument/2006/relationships" xmlns:m="http://schemas.openxmlformats.org/officeDocument/2006/math" xmlns:v="urn:schemas-microsoft-com:vml" xmlns:wp14="http://schemas.microsoft.com/office/word/2010/wordprocessingDrawing" xmlns:wp="http://schemas.openxmlformats.org/drawingml/2006/wordprocessingDrawing" xmlns:w10="urn:schemas-microsoft-com:office:word" xmlns:w="http://schemas.openxmlformats.org/wordprocessingml/2006/main" xmlns:w14="http://schemas.microsoft.com/office/word/2010/wordml" xmlns:w15="http://schemas.microsoft.com/office/word/2012/wordml" xmlns:w16cei="http://schemas.microsoft.com/office/word/2026/wordml/cei" xmlns:w16cex="http://schemas.microsoft.com/office/word/2018/wordml/cex" xmlns:w16cid="http://schemas.microsoft.com/office/word/2016/wordml/cid" xmlns:w16="http://schemas.microsoft.com/office/word/2018/wordml" xmlns:w16du="http://schemas.microsoft.com/office/word/2023/wordml/word16du" xmlns:w16sdtdh="http://schemas.microsoft.com/office/word/2020/wordml/sdtdatahash" xmlns:w16sdtfl="http://schemas.microsoft.com/office/word/2024/wordml/sdtformatlock" xmlns:w16se="http://schemas.microsoft.com/office/word/2015/wordml/symex" xmlns:wpg="http://schemas.microsoft.com/office/word/2010/wordprocessingGroup" xmlns:wpi="http://schemas.microsoft.com/office/word/2010/wordprocessingInk" xmlns:wne="http://schemas.microsoft.com/office/word/2006/wordml" xmlns:wps="http://schemas.microsoft.com/office/word/2010/wordprocessingShape" mc:Ignorable="w14 w15 w16se w16cid w16 w16cex w16sdtdh w16sdtfl w16du wp14">
   <w:p>
     <w:pPr>
       <w:spacing w:line="240" w:lineRule="auto"/>
@@ -3862,7 +3731,7 @@
 </file>
 
 <file path=word/numbering.xml><?xml version="1.0" encoding="utf-8"?>
-<w:numbering xmlns:wpc="http://schemas.microsoft.com/office/word/2010/wordprocessingCanvas" xmlns:cx="http://schemas.microsoft.com/office/drawing/2014/chartex" xmlns:cx1="http://schemas.microsoft.com/office/drawing/2015/9/8/chartex" xmlns:cx2="http://schemas.microsoft.com/office/drawing/2015/10/21/chartex" xmlns:cx3="http://schemas.microsoft.com/office/drawing/2016/5/9/chartex" xmlns:cx4="http://schemas.microsoft.com/office/drawing/2016/5/10/chartex" xmlns:cx5="http://schemas.microsoft.com/office/drawing/2016/5/11/chartex" xmlns:cx6="http://schemas.microsoft.com/office/drawing/2016/5/12/chartex" xmlns:cx7="http://schemas.microsoft.com/office/drawing/2016/5/13/chartex" xmlns:cx8="http://schemas.microsoft.com/office/drawing/2016/5/14/chartex" xmlns:mc="http://schemas.openxmlformats.org/markup-compatibility/2006" xmlns:aink="http://schemas.microsoft.com/office/drawing/2016/ink" xmlns:am3d="http://schemas.microsoft.com/office/drawing/2017/model3d" xmlns:o="urn:schemas-microsoft-com:office:office" xmlns:oel="http://schemas.microsoft.com/office/2019/extlst" xmlns:r="http://schemas.openxmlformats.org/officeDocument/2006/relationships" xmlns:m="http://schemas.openxmlformats.org/officeDocument/2006/math" xmlns:v="urn:schemas-microsoft-com:vml" xmlns:wp14="http://schemas.microsoft.com/office/word/2010/wordprocessingDrawing" xmlns:wp="http://schemas.openxmlformats.org/drawingml/2006/wordprocessingDrawing" xmlns:w10="urn:schemas-microsoft-com:office:word" xmlns:w="http://schemas.openxmlformats.org/wordprocessingml/2006/main" xmlns:w14="http://schemas.microsoft.com/office/word/2010/wordml" xmlns:w15="http://schemas.microsoft.com/office/word/2012/wordml" xmlns:w16cex="http://schemas.microsoft.com/office/word/2018/wordml/cex" xmlns:w16cid="http://schemas.microsoft.com/office/word/2016/wordml/cid" xmlns:w16="http://schemas.microsoft.com/office/word/2018/wordml" xmlns:w16du="http://schemas.microsoft.com/office/word/2023/wordml/word16du" xmlns:w16sdtdh="http://schemas.microsoft.com/office/word/2020/wordml/sdtdatahash" xmlns:w16sdtfl="http://schemas.microsoft.com/office/word/2024/wordml/sdtformatlock" xmlns:w16se="http://schemas.microsoft.com/office/word/2015/wordml/symex" xmlns:wpg="http://schemas.microsoft.com/office/word/2010/wordprocessingGroup" xmlns:wpi="http://schemas.microsoft.com/office/word/2010/wordprocessingInk" xmlns:wne="http://schemas.microsoft.com/office/word/2006/wordml" xmlns:wps="http://schemas.microsoft.com/office/word/2010/wordprocessingShape" mc:Ignorable="w14 w15 w16se w16cid w16 w16cex w16sdtdh w16sdtfl w16du wp14">
+<w:numbering xmlns:wpc="http://schemas.microsoft.com/office/word/2010/wordprocessingCanvas" xmlns:cx="http://schemas.microsoft.com/office/drawing/2014/chartex" xmlns:cx1="http://schemas.microsoft.com/office/drawing/2015/9/8/chartex" xmlns:cx2="http://schemas.microsoft.com/office/drawing/2015/10/21/chartex" xmlns:cx3="http://schemas.microsoft.com/office/drawing/2016/5/9/chartex" xmlns:cx4="http://schemas.microsoft.com/office/drawing/2016/5/10/chartex" xmlns:cx5="http://schemas.microsoft.com/office/drawing/2016/5/11/chartex" xmlns:cx6="http://schemas.microsoft.com/office/drawing/2016/5/12/chartex" xmlns:cx7="http://schemas.microsoft.com/office/drawing/2016/5/13/chartex" xmlns:cx8="http://schemas.microsoft.com/office/drawing/2016/5/14/chartex" xmlns:mc="http://schemas.openxmlformats.org/markup-compatibility/2006" xmlns:aink="http://schemas.microsoft.com/office/drawing/2016/ink" xmlns:am3d="http://schemas.microsoft.com/office/drawing/2017/model3d" xmlns:o="urn:schemas-microsoft-com:office:office" xmlns:oel="http://schemas.microsoft.com/office/2019/extlst" xmlns:r="http://schemas.openxmlformats.org/officeDocument/2006/relationships" xmlns:m="http://schemas.openxmlformats.org/officeDocument/2006/math" xmlns:v="urn:schemas-microsoft-com:vml" xmlns:wp14="http://schemas.microsoft.com/office/word/2010/wordprocessingDrawing" xmlns:wp="http://schemas.openxmlformats.org/drawingml/2006/wordprocessingDrawing" xmlns:w10="urn:schemas-microsoft-com:office:word" xmlns:w="http://schemas.openxmlformats.org/wordprocessingml/2006/main" xmlns:w14="http://schemas.microsoft.com/office/word/2010/wordml" xmlns:w15="http://schemas.microsoft.com/office/word/2012/wordml" xmlns:w16cei="http://schemas.microsoft.com/office/word/2026/wordml/cei" xmlns:w16cex="http://schemas.microsoft.com/office/word/2018/wordml/cex" xmlns:w16cid="http://schemas.microsoft.com/office/word/2016/wordml/cid" xmlns:w16="http://schemas.microsoft.com/office/word/2018/wordml" xmlns:w16du="http://schemas.microsoft.com/office/word/2023/wordml/word16du" xmlns:w16sdtdh="http://schemas.microsoft.com/office/word/2020/wordml/sdtdatahash" xmlns:w16sdtfl="http://schemas.microsoft.com/office/word/2024/wordml/sdtformatlock" xmlns:w16se="http://schemas.microsoft.com/office/word/2015/wordml/symex" xmlns:wpg="http://schemas.microsoft.com/office/word/2010/wordprocessingGroup" xmlns:wpi="http://schemas.microsoft.com/office/word/2010/wordprocessingInk" xmlns:wne="http://schemas.microsoft.com/office/word/2006/wordml" xmlns:wps="http://schemas.microsoft.com/office/word/2010/wordprocessingShape" mc:Ignorable="w14 w15 w16se w16cid w16 w16cex w16sdtdh w16sdtfl w16du wp14">
   <w:abstractNum w:abstractNumId="0" w15:restartNumberingAfterBreak="0">
     <w:nsid w:val="03963AFB"/>
     <w:multiLevelType w:val="hybridMultilevel"/>
@@ -10483,6 +10352,26 @@
 </file>
 
 <file path=customXml/item1.xml><?xml version="1.0" encoding="utf-8"?>
+<p:properties xmlns:p="http://schemas.microsoft.com/office/2006/metadata/properties" xmlns:xsi="http://www.w3.org/2001/XMLSchema-instance" xmlns:pc="http://schemas.microsoft.com/office/infopath/2007/PartnerControls">
+  <documentManagement>
+    <TaxCatchAll xmlns="4b8fbf8b-1220-443d-9737-fe6d9b6798d5" xsi:nil="true"/>
+    <lcf76f155ced4ddcb4097134ff3c332f xmlns="b8d09027-3915-499f-b0e7-28fda8d51cc7">
+      <Terms xmlns="http://schemas.microsoft.com/office/infopath/2007/PartnerControls"/>
+    </lcf76f155ced4ddcb4097134ff3c332f>
+  </documentManagement>
+</p:properties>
+</file>
+
+<file path=customXml/item2.xml><?xml version="1.0" encoding="utf-8"?>
+<?mso-contentType ?>
+<FormTemplates xmlns="http://schemas.microsoft.com/sharepoint/v3/contenttype/forms">
+  <Display>DocumentLibraryForm</Display>
+  <Edit>DocumentLibraryForm</Edit>
+  <New>DocumentLibraryForm</New>
+</FormTemplates>
+</file>
+
+<file path=customXml/item3.xml><?xml version="1.0" encoding="utf-8"?>
 <ct:contentTypeSchema xmlns:ct="http://schemas.microsoft.com/office/2006/metadata/contentType" xmlns:ma="http://schemas.microsoft.com/office/2006/metadata/properties/metaAttributes" ct:_="" ma:_="" ma:contentTypeName="Document" ma:contentTypeID="0x0101001BBECA09418D434985371152D78633BC" ma:contentTypeVersion="11" ma:contentTypeDescription="Create a new document." ma:contentTypeScope="" ma:versionID="1ff01b9c9ebe5baeac55163eb68a01fe">
   <xsd:schema xmlns:xsd="http://www.w3.org/2001/XMLSchema" xmlns:xs="http://www.w3.org/2001/XMLSchema" xmlns:p="http://schemas.microsoft.com/office/2006/metadata/properties" xmlns:ns2="b8d09027-3915-499f-b0e7-28fda8d51cc7" xmlns:ns3="4b8fbf8b-1220-443d-9737-fe6d9b6798d5" targetNamespace="http://schemas.microsoft.com/office/2006/metadata/properties" ma:root="true" ma:fieldsID="914701d973fbe8f1dcb4cc87e3d1187b" ns2:_="" ns3:_="">
     <xsd:import namespace="b8d09027-3915-499f-b0e7-28fda8d51cc7"/>
@@ -10677,31 +10566,30 @@
 </ct:contentTypeSchema>
 </file>
 
-<file path=customXml/item2.xml><?xml version="1.0" encoding="utf-8"?>
-<?mso-contentType ?>
-<FormTemplates xmlns="http://schemas.microsoft.com/sharepoint/v3/contenttype/forms">
-  <Display>DocumentLibraryForm</Display>
-  <Edit>DocumentLibraryForm</Edit>
-  <New>DocumentLibraryForm</New>
-</FormTemplates>
-</file>
-
-<file path=customXml/item3.xml><?xml version="1.0" encoding="utf-8"?>
-<p:properties xmlns:p="http://schemas.microsoft.com/office/2006/metadata/properties" xmlns:xsi="http://www.w3.org/2001/XMLSchema-instance" xmlns:pc="http://schemas.microsoft.com/office/infopath/2007/PartnerControls">
-  <documentManagement>
-    <TaxCatchAll xmlns="4b8fbf8b-1220-443d-9737-fe6d9b6798d5" xsi:nil="true"/>
-    <lcf76f155ced4ddcb4097134ff3c332f xmlns="b8d09027-3915-499f-b0e7-28fda8d51cc7">
-      <Terms xmlns="http://schemas.microsoft.com/office/infopath/2007/PartnerControls"/>
-    </lcf76f155ced4ddcb4097134ff3c332f>
-  </documentManagement>
-</p:properties>
-</file>
-
 <file path=customXml/item4.xml><?xml version="1.0" encoding="utf-8"?>
 <b:Sources xmlns:b="http://schemas.openxmlformats.org/officeDocument/2006/bibliography" xmlns="http://schemas.openxmlformats.org/officeDocument/2006/bibliography" SelectedStyle="\APASixthEditionOfficeOnline.xsl" StyleName="APA" Version="6"/>
 </file>
 
 <file path=customXml/itemProps1.xml><?xml version="1.0" encoding="utf-8"?>
+<ds:datastoreItem xmlns:ds="http://schemas.openxmlformats.org/officeDocument/2006/customXml" ds:itemID="{34852BB7-EAEF-4CC2-8396-1E9381839262}">
+  <ds:schemaRefs>
+    <ds:schemaRef ds:uri="http://schemas.microsoft.com/office/2006/metadata/properties"/>
+    <ds:schemaRef ds:uri="http://schemas.microsoft.com/office/infopath/2007/PartnerControls"/>
+    <ds:schemaRef ds:uri="4b8fbf8b-1220-443d-9737-fe6d9b6798d5"/>
+    <ds:schemaRef ds:uri="b8d09027-3915-499f-b0e7-28fda8d51cc7"/>
+  </ds:schemaRefs>
+</ds:datastoreItem>
+</file>
+
+<file path=customXml/itemProps2.xml><?xml version="1.0" encoding="utf-8"?>
+<ds:datastoreItem xmlns:ds="http://schemas.openxmlformats.org/officeDocument/2006/customXml" ds:itemID="{E093A7A9-8BFB-4760-8EFC-B6FB8C029753}">
+  <ds:schemaRefs>
+    <ds:schemaRef ds:uri="http://schemas.microsoft.com/sharepoint/v3/contenttype/forms"/>
+  </ds:schemaRefs>
+</ds:datastoreItem>
+</file>
+
+<file path=customXml/itemProps3.xml><?xml version="1.0" encoding="utf-8"?>
 <ds:datastoreItem xmlns:ds="http://schemas.openxmlformats.org/officeDocument/2006/customXml" ds:itemID="{06D3BEE8-662B-46FF-B0A5-4E87316B82DD}">
   <ds:schemaRefs>
     <ds:schemaRef ds:uri="http://schemas.microsoft.com/office/2006/metadata/contentType"/>
@@ -10720,25 +10608,6 @@
 </ds:datastoreItem>
 </file>
 
-<file path=customXml/itemProps2.xml><?xml version="1.0" encoding="utf-8"?>
-<ds:datastoreItem xmlns:ds="http://schemas.openxmlformats.org/officeDocument/2006/customXml" ds:itemID="{E093A7A9-8BFB-4760-8EFC-B6FB8C029753}">
-  <ds:schemaRefs>
-    <ds:schemaRef ds:uri="http://schemas.microsoft.com/sharepoint/v3/contenttype/forms"/>
-  </ds:schemaRefs>
-</ds:datastoreItem>
-</file>
-
-<file path=customXml/itemProps3.xml><?xml version="1.0" encoding="utf-8"?>
-<ds:datastoreItem xmlns:ds="http://schemas.openxmlformats.org/officeDocument/2006/customXml" ds:itemID="{34852BB7-EAEF-4CC2-8396-1E9381839262}">
-  <ds:schemaRefs>
-    <ds:schemaRef ds:uri="http://schemas.microsoft.com/office/2006/metadata/properties"/>
-    <ds:schemaRef ds:uri="http://schemas.microsoft.com/office/infopath/2007/PartnerControls"/>
-    <ds:schemaRef ds:uri="4b8fbf8b-1220-443d-9737-fe6d9b6798d5"/>
-    <ds:schemaRef ds:uri="b8d09027-3915-499f-b0e7-28fda8d51cc7"/>
-  </ds:schemaRefs>
-</ds:datastoreItem>
-</file>
-
 <file path=customXml/itemProps4.xml><?xml version="1.0" encoding="utf-8"?>
 <ds:datastoreItem xmlns:ds="http://schemas.openxmlformats.org/officeDocument/2006/customXml" ds:itemID="{C02F71C2-1B63-49B1-9CC4-ECCD75C68080}">
   <ds:schemaRefs>

</xml_diff>